<commit_message>
fix(bab9): kemaskini subtajuk 2 (Umar bin Abdul Aziz) dan subtajuk 4 (Hasan al-Basri) v26
</commit_message>
<xml_diff>
--- a/INTISARI_ILMIAH_LENGKAP_AL_RAQAIQ.docx
+++ b/INTISARI_ILMIAH_LENGKAP_AL_RAQAIQ.docx
@@ -1797,13 +1797,8 @@
         <w:ind w:left="360"/>
       </w:pPr>
       <w:r>
-        <w:rPr>
-          <w:b/>
-          <w:color w:val="1B4332"/>
-        </w:rPr>
-        <w:t xml:space="preserve">• Lalu Muncul Umar di Syam: </w:t>
+        <w:t xml:space="preserve">• Muncullah Umar bin Abdul Aziz di Syam: </w:t>
       </w:r>
-      <w:r/>
     </w:p>
     <w:p>
       <w:pPr>
@@ -1843,13 +1838,8 @@
         <w:ind w:left="360"/>
       </w:pPr>
       <w:r>
-        <w:rPr>
-          <w:b/>
-          <w:color w:val="1B4332"/>
-        </w:rPr>
-        <w:t xml:space="preserve">• Neraca Basrah dalam Fiqh Dakwah: </w:t>
+        <w:t xml:space="preserve">• Neraca Hasan al-Basri dalam Fiqh Dakwah: </w:t>
       </w:r>
-      <w:r/>
     </w:p>
     <w:p>
       <w:pPr>

</xml_diff>

<commit_message>
fix(bab7): selaraskan tajuk Bab 7 dan subtajuk 1 kepada Penjara Harapan v27
</commit_message>
<xml_diff>
--- a/INTISARI_ILMIAH_LENGKAP_AL_RAQAIQ.docx
+++ b/INTISARI_ILMIAH_LENGKAP_AL_RAQAIQ.docx
@@ -1314,12 +1314,7 @@
         <w:spacing w:before="240" w:after="80"/>
       </w:pPr>
       <w:r>
-        <w:rPr>
-          <w:b/>
-          <w:color w:val="2D6A4F"/>
-          <w:sz w:val="26"/>
-        </w:rPr>
-        <w:t>📌 BAB 7: KEPUNGAN ANGAN-ANGAN</w:t>
+        <w:t>📌 BAB 7: PENJARA HARAPAN</w:t>
       </w:r>
     </w:p>
     <w:p>

</xml_diff>

<commit_message>
fix: gugurkan awalan 'Dan' pada semua subtajuk dan selaraskan Mazhab Hanbali v28
</commit_message>
<xml_diff>
--- a/INTISARI_ILMIAH_LENGKAP_AL_RAQAIQ.docx
+++ b/INTISARI_ILMIAH_LENGKAP_AL_RAQAIQ.docx
@@ -1016,13 +1016,8 @@
         <w:ind w:left="360"/>
       </w:pPr>
       <w:r>
-        <w:rPr>
-          <w:b/>
-          <w:color w:val="1B4332"/>
-        </w:rPr>
-        <w:t xml:space="preserve">• Dan Kita Mengiringinya dengan Persaudaraan...: </w:t>
+        <w:t xml:space="preserve">• Kita Mengiringinya dengan Persaudaraan...: </w:t>
       </w:r>
-      <w:r/>
     </w:p>
     <w:p>
       <w:pPr>
@@ -1874,13 +1869,8 @@
         <w:ind w:left="360"/>
       </w:pPr>
       <w:r>
-        <w:rPr>
-          <w:b/>
-          <w:color w:val="1B4332"/>
-        </w:rPr>
-        <w:t xml:space="preserve">• Tarbiah Melalui Pengakuan &amp; Dan Selepas Itu...: </w:t>
+        <w:t xml:space="preserve">• Tarbiah Melalui Pengakuan &amp; Selepas Itu...: </w:t>
       </w:r>
-      <w:r/>
     </w:p>
     <w:p>
       <w:pPr>
@@ -2007,13 +1997,8 @@
         <w:ind w:left="360"/>
       </w:pPr>
       <w:r>
-        <w:rPr>
-          <w:b/>
-          <w:color w:val="1B4332"/>
-        </w:rPr>
-        <w:t xml:space="preserve">• Dan Selepas Itu...: </w:t>
+        <w:t xml:space="preserve">• Selepas Itu...: </w:t>
       </w:r>
-      <w:r/>
     </w:p>
     <w:p>
       <w:pPr>
@@ -2466,13 +2451,8 @@
         <w:ind w:left="360"/>
       </w:pPr>
       <w:r>
-        <w:rPr>
-          <w:b/>
-          <w:color w:val="1B4332"/>
-        </w:rPr>
-        <w:t xml:space="preserve">• Ulama Hanabilah Memelihara Keterampilan dan Wibawa: </w:t>
+        <w:t xml:space="preserve">• Ulama Mazhab Hanbali Memelihara Keterampilan dan Wibawa: </w:t>
       </w:r>
-      <w:r/>
     </w:p>
     <w:p>
       <w:pPr>
@@ -2512,13 +2492,8 @@
         <w:ind w:left="360"/>
       </w:pPr>
       <w:r>
-        <w:rPr>
-          <w:b/>
-          <w:color w:val="1B4332"/>
-        </w:rPr>
-        <w:t xml:space="preserve">• Dan Kemuliaan Tatkala Saat Kematian... !: </w:t>
+        <w:t xml:space="preserve">• Kemuliaan Tatkala Saat Kematian... !: </w:t>
       </w:r>
-      <w:r/>
     </w:p>
     <w:p>
       <w:pPr>

</xml_diff>

<commit_message>
feat: tambah Epilog/Epigraf 'Penjara Harapan' lukisan abstrak Islam sebelum Mukadimah v30
</commit_message>
<xml_diff>
--- a/INTISARI_ILMIAH_LENGKAP_AL_RAQAIQ.docx
+++ b/INTISARI_ILMIAH_LENGKAP_AL_RAQAIQ.docx
@@ -44,6 +44,25 @@
       </w:pPr>
       <w:r>
         <w:t>**Penyelarasan &amp; Terjemahan:** Projek Terjemahan Akademik Lengkap *Al-Raqā'iq* (Format Bahasa Melayu Standard Laras Sastera Dakwah)</w:t>
+      </w:r>
+    </w:p>
+    <w:p>
+      <w:pPr>
+        <w:pStyle w:val="Heading1"/>
+      </w:pPr>
+      <w:r>
+        <w:t>EPILOG / EPIGRAF: PENJARA HARAPAN</w:t>
+      </w:r>
+    </w:p>
+    <w:p>
+      <w:r>
+        <w:t>Sebuah Lukisan Seni Lukisan Abstrak Islam (حِصَارُ الأَمَلِ)</w:t>
+        <w:br/>
+        <w:br/>
+        <w:t>• Ringkasan Epilog / Epigraf: Mengilustrasikan hadis sahih Rasulullah SAW mengenai hakikat manusia yang terkurung dalam kepungan ajal maut, sementara angan-angannya menjangkau jauh melintasi sempadan usia.</w:t>
+        <w:br/>
+        <w:t>• Fiqh Haraki: Menjadi pencetus muhasabah ruhiyyah dan pemangkin tajdid niat para da'i sebelum mendalami perbahasan seterusnya.</w:t>
+        <w:br/>
       </w:r>
     </w:p>
     <w:p>

</xml_diff>

<commit_message>
Selaraskan tanda petik simbol pada tajuk Bab 7 dan Bab 8 (v33)
</commit_message>
<xml_diff>
--- a/INTISARI_ILMIAH_LENGKAP_AL_RAQAIQ.docx
+++ b/INTISARI_ILMIAH_LENGKAP_AL_RAQAIQ.docx
@@ -1328,7 +1328,7 @@
         <w:spacing w:before="240" w:after="80"/>
       </w:pPr>
       <w:r>
-        <w:t>📌 BAB 7: PENJARA HARAPAN</w:t>
+        <w:t>📌 BAB 7: "PENJARA HARAPAN"</w:t>
       </w:r>
     </w:p>
     <w:p>
@@ -1530,7 +1530,7 @@
           <w:color w:val="2D6A4F"/>
           <w:sz w:val="26"/>
         </w:rPr>
-        <w:t>📌 BAB 8: KUBUR-KUBUR KITA YANG KAKU</w:t>
+        <w:t>📌 BAB 8: "KUBUR-KUBUR KITA YANG KAKU"</w:t>
       </w:r>
     </w:p>
     <w:p>

</xml_diff>

<commit_message>
Selaraskan tanda petik khusus pada perkataan Penjara dan Kubur-kubur (v34)
</commit_message>
<xml_diff>
--- a/INTISARI_ILMIAH_LENGKAP_AL_RAQAIQ.docx
+++ b/INTISARI_ILMIAH_LENGKAP_AL_RAQAIQ.docx
@@ -1328,7 +1328,7 @@
         <w:spacing w:before="240" w:after="80"/>
       </w:pPr>
       <w:r>
-        <w:t>📌 BAB 7: "PENJARA HARAPAN"</w:t>
+        <w:t>📌 BAB 7: "PENJARA" HARAPAN</w:t>
       </w:r>
     </w:p>
     <w:p>
@@ -1530,7 +1530,7 @@
           <w:color w:val="2D6A4F"/>
           <w:sz w:val="26"/>
         </w:rPr>
-        <w:t>📌 BAB 8: "KUBUR-KUBUR KITA YANG KAKU"</w:t>
+        <w:t>📌 BAB 8: "KUBUR-KUBUR" KITA YANG KAKU</w:t>
       </w:r>
     </w:p>
     <w:p>

</xml_diff>

<commit_message>
Pecahkan subtajuk 2 Mukadimah kepada 5 subtajuk tersendiri (Kaedah B - v35)
</commit_message>
<xml_diff>
--- a/INTISARI_ILMIAH_LENGKAP_AL_RAQAIQ.docx
+++ b/INTISARI_ILMIAH_LENGKAP_AL_RAQAIQ.docx
@@ -48,21 +48,89 @@
     </w:p>
     <w:p>
       <w:pPr>
-        <w:pStyle w:val="Heading1"/>
+        <w:keepNext/>
+        <w:spacing w:before="240" w:after="80"/>
       </w:pPr>
       <w:r>
-        <w:t>EPILOG / EPIGRAF: PENJARA HARAPAN</w:t>
+        <w:rPr>
+          <w:b/>
+          <w:color w:val="2D6A4F"/>
+          <w:sz w:val="26"/>
+        </w:rPr>
+        <w:t>📌 EPILOG / EPIGRAF: PENJARA HARAPAN</w:t>
       </w:r>
     </w:p>
     <w:p>
+      <w:pPr>
+        <w:keepNext/>
+        <w:spacing w:before="200" w:after="60"/>
+      </w:pPr>
       <w:r>
-        <w:t>Sebuah Lukisan Seni Lukisan Abstrak Islam (حِصَارُ الأَمَلِ)</w:t>
-        <w:br/>
-        <w:br/>
-        <w:t>• Ringkasan Epilog / Epigraf: Mengilustrasikan hadis sahih Rasulullah SAW mengenai hakikat manusia yang terkurung dalam kepungan ajal maut, sementara angan-angannya menjangkau jauh melintasi sempadan usia.</w:t>
-        <w:br/>
-        <w:t>• Fiqh Haraki: Menjadi pencetus muhasabah ruhiyyah dan pemangkin tajdid niat para da'i sebelum mendalami perbahasan seterusnya.</w:t>
-        <w:br/>
+        <w:rPr>
+          <w:b/>
+          <w:color w:val="081C15"/>
+          <w:sz w:val="24"/>
+        </w:rPr>
+        <w:t>*(Ḥiṣār al-Amal - حِصَارُ الأَمَلِ)*</w:t>
+      </w:r>
+    </w:p>
+    <w:p>
+      <w:pPr>
+        <w:spacing w:before="40" w:after="40"/>
+        <w:ind w:left="360"/>
+      </w:pPr>
+      <w:r>
+        <w:rPr>
+          <w:b/>
+          <w:color w:val="1B4332"/>
+        </w:rPr>
+        <w:t xml:space="preserve">Ringkasan Epilog / Epigraf: </w:t>
+      </w:r>
+      <w:r/>
+    </w:p>
+    <w:p>
+      <w:pPr>
+        <w:spacing w:before="40" w:after="40" w:line="276" w:lineRule="auto"/>
+      </w:pPr>
+      <w:r>
+        <w:t>Kitab *Al-Raqā'iq* didahului oleh sebuah epigraf berupa lakaran seni lukisan abstrak Islam bertajuk **"Penjara Harapan"** (*Ḥiṣār al-Amal*). Lakaran ini diilhamkan daripada hadis sahih Rasulullah SAW (riwayat Abdullah bin Mas'ud RA dalam Sahih al-Bukhari) mengenai manusia yang terkurung dalam kepungan ajal maut, sementara angan-angan kosongnya melangkaui sempadan usia.</w:t>
+      </w:r>
+    </w:p>
+    <w:p>
+      <w:pPr>
+        <w:spacing w:before="40" w:after="40"/>
+        <w:ind w:left="360"/>
+      </w:pPr>
+      <w:r>
+        <w:rPr>
+          <w:b/>
+          <w:color w:val="1B4332"/>
+        </w:rPr>
+        <w:t xml:space="preserve">Intisari Subtajuk: </w:t>
+      </w:r>
+      <w:r/>
+    </w:p>
+    <w:p>
+      <w:pPr>
+        <w:spacing w:before="40" w:after="40"/>
+        <w:ind w:left="360"/>
+      </w:pPr>
+      <w:r>
+        <w:rPr>
+          <w:b/>
+          <w:color w:val="1B4332"/>
+        </w:rPr>
+        <w:t xml:space="preserve">• Sebuah Lukisan Seni Lukisan Abstrak Islam: </w:t>
+      </w:r>
+      <w:r/>
+    </w:p>
+    <w:p>
+      <w:pPr>
+        <w:spacing w:before="40" w:after="40"/>
+        <w:ind w:left="360"/>
+      </w:pPr>
+      <w:r>
+        <w:t>Mengupas empat elemen lukisan Nabawi: lembaga insan di tengah, kotak segi empat ajal maut yang mengepung, garisan angan-angan panjang menjulur keluar, dan anak-anak panah pelbagai rintangan penyakit/musibah yang sedia menerkam. Menjadi pencetus muhasabah ruhiyyah dan pemangkin tajdid niat sebelum melangkah masuk ke dalam taman rohani *Al-Raqā'iq*.</w:t>
       </w:r>
     </w:p>
     <w:p>
@@ -90,7 +158,7 @@
           <w:color w:val="081C15"/>
           <w:sz w:val="24"/>
         </w:rPr>
-        <w:t>*(Al-Nafs al-Mu’minah - النَّفْسُ المُؤْمِنَةُ)* | Halaman Asal 7 – 14</w:t>
+        <w:t>*(Al-Nafs al-Mu’minah - النَّفْسُ المُؤْمِنَةُ)*</w:t>
       </w:r>
     </w:p>
     <w:p>
@@ -112,7 +180,7 @@
         <w:spacing w:before="40" w:after="40" w:line="276" w:lineRule="auto"/>
       </w:pPr>
       <w:r>
-        <w:t>Gerakan dakwah Islamiah berdiri di atas dua rukun utama: memilih pemuda yang berani dan cerdas, serta mentarbiah mereka dengan tarbiah yang mendalam, syumul dan kental. Syeikh al-Rasyid menegaskan bahawa bahaya terbesar sesebuah harakah adalah "kebankrapan kader" apabila tokoh-tokohnya lenyap seorang demi seorang tanpa pengganti yang setaraf. Jiwa yang beriman adalah benteng pertahanan terakhir; tanpa penyucian jiwa dan pelembut hati (*al-raqā'iq*), gerakan akan menjadi jasad kaku yang kehilangan roh perjuangan.</w:t>
+        <w:t>Gerakan dakwah Islam berdiri di atas dua rukun utama: memilih pemuda yang berani dan cerdas, serta mentarbiah mereka dengan tarbiah yang mendalam, syumul dan kental. Syeikh al-Rasyid menegaskan bahawa bahaya terbesar sesebuah harakah adalah "kebankrapan kader" apabila tokoh-tokohnya lenyap seorang demi seorang tanpa pengganti yang setaraf. Jiwa yang beriman adalah benteng pertahanan terakhir; tanpa penyucian jiwa dan pelembut hati (*al-raqā'iq*), gerakan akan menjadi jasad kaku yang kehilangan roh perjuangan.</w:t>
       </w:r>
     </w:p>
     <w:p>
@@ -139,7 +207,30 @@
           <w:b/>
           <w:color w:val="1B4332"/>
         </w:rPr>
-        <w:t xml:space="preserve">• Gerakan Islamiah Wajib Memiliki Firasat Meneliti Dirinya Sendiri: </w:t>
+        <w:t xml:space="preserve">• Pengenalan: Jiwa Yang Beriman: </w:t>
+      </w:r>
+      <w:r/>
+    </w:p>
+    <w:p>
+      <w:pPr>
+        <w:spacing w:before="40" w:after="40"/>
+        <w:ind w:left="360"/>
+      </w:pPr>
+      <w:r>
+        <w:t>Kewajipan melahirkan tokoh pemikul dakwah yang mengemudi bahtera perjuangan bagi mengelakkan bahaya kebankrapan kader (pesanan Syeikh Abu al-Hasan al-Nadwi).</w:t>
+      </w:r>
+    </w:p>
+    <w:p>
+      <w:pPr>
+        <w:spacing w:before="40" w:after="40"/>
+        <w:ind w:left="360"/>
+      </w:pPr>
+      <w:r>
+        <w:rPr>
+          <w:b/>
+          <w:color w:val="1B4332"/>
+        </w:rPr>
+        <w:t xml:space="preserve">• Firasat Meneliti Diri dan Neraca Tarbiah Harakiyyah: </w:t>
       </w:r>
       <w:r/>
     </w:p>
@@ -271,6 +362,107 @@
     </w:p>
     <w:p>
       <w:pPr>
+        <w:spacing w:before="40" w:after="40"/>
+        <w:ind w:left="360"/>
+      </w:pPr>
+      <w:r>
+        <w:rPr>
+          <w:b/>
+          <w:color w:val="1B4332"/>
+        </w:rPr>
+        <w:t xml:space="preserve">• Ketenangan Jiwa dan Daya Lajakan Asal: </w:t>
+      </w:r>
+      <w:r/>
+    </w:p>
+    <w:p>
+      <w:pPr>
+        <w:spacing w:before="40" w:after="40"/>
+        <w:ind w:left="360"/>
+      </w:pPr>
+      <w:r>
+        <w:t>Menghuraikan bait Ahmad al-Mukhtar al-Wazir tentang keindahan sifat jiwa beriman: *Sākinatun fī samtihā* (tenang dalam diam, lebih fasih berbicara daripada mereka yang berkata-kata) dan *Al-Munṭalaq* (daya lajakan asal yang segera menyegerakan kembali jika terhenti seketika). Jeda rehat bukanlah kelesuan, dan godaan syaitan tidak mampu memperdaya bashirah mukmin.</w:t>
+      </w:r>
+    </w:p>
+    <w:p>
+      <w:pPr>
+        <w:spacing w:before="40" w:after="40"/>
+        <w:ind w:left="360"/>
+      </w:pPr>
+      <w:r>
+        <w:rPr>
+          <w:b/>
+          <w:color w:val="1B4332"/>
+        </w:rPr>
+        <w:t xml:space="preserve">• Kilauan Bayang di Permukaan Tasik: </w:t>
+      </w:r>
+      <w:r/>
+    </w:p>
+    <w:p>
+      <w:pPr>
+        <w:spacing w:before="40" w:after="40"/>
+        <w:ind w:left="360"/>
+      </w:pPr>
+      <w:r>
+        <w:t>Drama alegori rama-rama yang berlegar di sekitar bayangannya di permukaan air: terpesona melihat kilauan bintang di kaki langit air, melayang merenung hingga hampir binasa lemas, namun diselamatkan oleh benteng keimanan (*Lākinna-hā mu'minatun, la tastahmiq*).</w:t>
+      </w:r>
+    </w:p>
+    <w:p>
+      <w:pPr>
+        <w:spacing w:before="40" w:after="40"/>
+        <w:ind w:left="360"/>
+      </w:pPr>
+      <w:r>
+        <w:rPr>
+          <w:b/>
+          <w:color w:val="1B4332"/>
+        </w:rPr>
+        <w:t xml:space="preserve">• Simpang Petunjuk dan Keperluan Amaran Pelembut Hati: </w:t>
+      </w:r>
+      <w:r/>
+    </w:p>
+    <w:p>
+      <w:pPr>
+        <w:spacing w:before="40" w:after="40"/>
+        <w:ind w:left="360"/>
+      </w:pPr>
+      <w:r>
+        <w:t>Membezakan antara hakikat kebenaran dengan getaran fatamorgana riak air (*Baina adh-Dhalāl wa al-Hudā*). Kepentingan kitab *Al-Raqā'iq* sebagai loceng amaran sebelum jiwa tersungkur lemas ke lembah fitnah.</w:t>
+      </w:r>
+    </w:p>
+    <w:p>
+      <w:pPr>
+        <w:spacing w:before="40" w:after="40"/>
+        <w:ind w:left="360"/>
+      </w:pPr>
+      <w:r>
+        <w:rPr>
+          <w:b/>
+          <w:color w:val="1B4332"/>
+        </w:rPr>
+        <w:t xml:space="preserve">• Ketinggian Iman Mendepani Falsafah Bahimiyyah: </w:t>
+      </w:r>
+      <w:r/>
+    </w:p>
+    <w:p>
+      <w:pPr>
+        <w:spacing w:before="40" w:after="40"/>
+        <w:ind w:left="360"/>
+      </w:pPr>
+      <w:r>
+        <w:t>Menelanjangi kesesatan penyair ateis yang menyeru kepada kelazatan syahwat haiwani (*bahimiyyah*) dan mendakwa tanah kubur menyamakan orang dungu dan orang genius.</w:t>
+      </w:r>
+    </w:p>
+    <w:p>
+      <w:pPr>
+        <w:spacing w:before="40" w:after="40"/>
+        <w:ind w:left="360"/>
+      </w:pPr>
+      <w:r>
+        <w:t>Hujah mantik Abu Sulaiman al-Sijistani (riwayat Abu Hayyan al-Tauhidi): bumi hanya membalut jasad dan bangkai kasar manusia, bukan membalut iman, tauhid, kezuhudan, ketaatan, dan makrifat mereka.</w:t>
+      </w:r>
+    </w:p>
+    <w:p>
+      <w:pPr>
         <w:keepNext/>
         <w:spacing w:before="240" w:after="80"/>
       </w:pPr>
@@ -294,7 +486,7 @@
           <w:color w:val="081C15"/>
           <w:sz w:val="24"/>
         </w:rPr>
-        <w:t>*(Tasbīh Yasyuddu al-Mulk - تَسْبِيحٌ يَشُدُّ المُلْكَ)* | Halaman Asal 15 – 26</w:t>
+        <w:t>*(Tasbih Yang Mengukuhkan Kerajaan - تَسْبِيحٌ يَشُدُّ المُلْكَ)*</w:t>
       </w:r>
     </w:p>
     <w:p>
@@ -426,7 +618,7 @@
         <w:ind w:left="360"/>
       </w:pPr>
       <w:r>
-        <w:t>Amaran keras terhadap "syaitan kelalaian" yang cuba mencuri waktu-waktu sujud seorang daie di sebalik kesibukan kerja-kerja teknikal harakah.</w:t>
+        <w:t>Amaran keras terhadap "syaitan kelalaian" yang cuba mencuri waktu-waktu sujud seorang da'i di sebalik kesibukan kerja-kerja teknikal harakah.</w:t>
       </w:r>
     </w:p>
     <w:p>
@@ -454,7 +646,7 @@
           <w:color w:val="081C15"/>
           <w:sz w:val="24"/>
         </w:rPr>
-        <w:t>*(Al-Daqā'iq al-Ghāliyah - الدَّقَائِقُ الغَالِيَةُ)* | Halaman Asal 27 – 37</w:t>
+        <w:t>*(Syurga Orang yang Beriman Berada di Mihrabnya - الدَّقَائِقُ الغَالِيَةُ)*</w:t>
       </w:r>
     </w:p>
     <w:p>
@@ -545,7 +737,7 @@
         <w:ind w:left="360"/>
       </w:pPr>
       <w:r>
-        <w:t>Refleksi mendalam daripada bait penyair: Malunya seorang daie apabila burung merpati telah bangun bertasbih pada waktu fajar menyingsing, sedangkan manusia yang memikul risalah dakwah masih lena dibalut kehangatan selimut.</w:t>
+        <w:t>Refleksi mendalam daripada bait penyair: Malunya seorang da'i apabila burung merpati telah bangun bertasbih pada waktu fajar menyingsing, sedangkan manusia yang memikul risalah dakwah masih lena dibalut kehangatan selimut.</w:t>
       </w:r>
     </w:p>
     <w:p>
@@ -582,7 +774,7 @@
           <w:color w:val="081C15"/>
           <w:sz w:val="24"/>
         </w:rPr>
-        <w:t>*(Al-Ibtidā' - الابْتِدَاءُ)* | Halaman Asal 39 – 48</w:t>
+        <w:t>*(Permulaan - الابْتِدَاءُ)*</w:t>
       </w:r>
     </w:p>
     <w:p>
@@ -742,7 +934,7 @@
           <w:color w:val="081C15"/>
           <w:sz w:val="24"/>
         </w:rPr>
-        <w:t>*(Naḥwa Afrāḥ al-Ākhirah - نَحْوَ أَفْرَاحِ الآخِرَةِ)* | Halaman Asal 49 – 62</w:t>
+        <w:t>*(Menuju Kegembiraan Akhirat - نَحْوَ أَفْرَاحِ الآخِرَةِ)*</w:t>
       </w:r>
     </w:p>
     <w:p>
@@ -764,7 +956,7 @@
         <w:spacing w:before="40" w:after="40" w:line="276" w:lineRule="auto"/>
       </w:pPr>
       <w:r>
-        <w:t>Perjalanan seorang daie adalah perjalanan merentas dunia yang fana menuju majlis-majlis kegembiraan abadi di syurga (*afrāḥ al-ākhirah*). Dunia ini bukanlah tempat berehat atau bersenang-lenang; martabat yang tinggi di akhirat hanya boleh ditebus dengan keletihan dan kelelahan yang berterusan di dunia.</w:t>
+        <w:t>Perjalanan seorang da'i adalah perjalanan merentas dunia yang fana menuju majlis-majlis kegembiraan abadi di syurga (*afrāḥ al-ākhirah*). Dunia ini bukanlah tempat berehat atau bersenang-lenang; martabat yang tinggi di akhirat hanya boleh ditebus dengan keletihan dan kelelahan yang berterusan di dunia.</w:t>
       </w:r>
     </w:p>
     <w:p>
@@ -814,7 +1006,7 @@
           <w:b/>
           <w:color w:val="1B4332"/>
         </w:rPr>
-        <w:t xml:space="preserve">• Dan Engkau Pemilik Iman: </w:t>
+        <w:t xml:space="preserve">• Engkau Pemilik Iman: </w:t>
       </w:r>
       <w:r/>
     </w:p>
@@ -837,7 +1029,7 @@
           <w:b/>
           <w:color w:val="1B4332"/>
         </w:rPr>
-        <w:t xml:space="preserve">• Dan Manusia yang Paling Penat Ialah yang Agung Tuntutan Cita-Citanya: </w:t>
+        <w:t xml:space="preserve">• Manusia yang Paling Penat Ialah yang Agung Tuntutan Cita-Citanya: </w:t>
       </w:r>
       <w:r/>
     </w:p>
@@ -860,7 +1052,7 @@
           <w:b/>
           <w:color w:val="1B4332"/>
         </w:rPr>
-        <w:t xml:space="preserve">• Dan Engkau Insan Merdeka yang Mulia: </w:t>
+        <w:t xml:space="preserve">• Engkau Insan Merdeka yang Mulia: </w:t>
       </w:r>
       <w:r/>
     </w:p>
@@ -883,7 +1075,7 @@
           <w:b/>
           <w:color w:val="1B4332"/>
         </w:rPr>
-        <w:t xml:space="preserve">• Dan Engkau Pemilik Matlamat: </w:t>
+        <w:t xml:space="preserve">• Engkau Pemilik Matlamat: </w:t>
       </w:r>
       <w:r/>
     </w:p>
@@ -893,7 +1085,7 @@
         <w:ind w:left="360"/>
       </w:pPr>
       <w:r>
-        <w:t>Matlamat yang jelas memandu daie agar tidak terpesong oleh godaan remeh di tepi jalan.</w:t>
+        <w:t>Matlamat yang jelas memandu da'i agar tidak terpesong oleh godaan remeh di tepi jalan.</w:t>
       </w:r>
     </w:p>
     <w:p>
@@ -906,7 +1098,7 @@
           <w:b/>
           <w:color w:val="1B4332"/>
         </w:rPr>
-        <w:t xml:space="preserve">• Dan Engkau Penuntut Akses Menuju Allah: </w:t>
+        <w:t xml:space="preserve">• Engkau Penuntut Akses Menuju Allah: </w:t>
       </w:r>
       <w:r/>
     </w:p>
@@ -967,7 +1159,7 @@
           <w:color w:val="081C15"/>
           <w:sz w:val="24"/>
         </w:rPr>
-        <w:t>*(Al-Ukhuwwah Syi'ār Da'watinā - الأُخُوَّةُ شِعَارُ دَعْوَتِنَا)* | Halaman Asal 63 – 82</w:t>
+        <w:t>*(Persaudaraan Syiar Dakwah Kita - الأُخُوَّةُ شِعَارُ دَعْوَتِنَا)*</w:t>
       </w:r>
     </w:p>
     <w:p>
@@ -989,7 +1181,7 @@
         <w:spacing w:before="40" w:after="40" w:line="276" w:lineRule="auto"/>
       </w:pPr>
       <w:r>
-        <w:t>Persaudaraan Islamiah (*ukhuwwah*) bukanlah sekadar slogan retorik atau kemesraan luaran, sebaliknya ia adalah tiang penegak tanzim dakwah yang berakar umbi pada ketakwaan. Syeikh al-Rasyid memperincikan etika pergaulan para kader serta amaran keras terhadap penyakit-penyakit majlis yang boleh meretakkan saf perjuangan.</w:t>
+        <w:t>Persaudaraan Islam (*ukhuwwah*) bukanlah sekadar slogan retorik atau kemesraan luaran, sebaliknya ia adalah tiang penegak tanzim dakwah yang berakar umbi pada ketakwaan. Syeikh al-Rasyid memperincikan etika pergaulan para kader serta amaran keras terhadap penyakit-penyakit majlis yang boleh meretakkan saf perjuangan.</w:t>
       </w:r>
     </w:p>
     <w:p>
@@ -1035,8 +1227,13 @@
         <w:ind w:left="360"/>
       </w:pPr>
       <w:r>
+        <w:rPr>
+          <w:b/>
+          <w:color w:val="1B4332"/>
+        </w:rPr>
         <w:t xml:space="preserve">• Kita Mengiringinya dengan Persaudaraan...: </w:t>
       </w:r>
+      <w:r/>
     </w:p>
     <w:p>
       <w:pPr>
@@ -1203,7 +1400,7 @@
           <w:color w:val="081C15"/>
           <w:sz w:val="24"/>
         </w:rPr>
-        <w:t>*(Asyjār al-Īmān - أَشْجَارُ الإِيمَانِ)* | Halaman Asal 83 – 96</w:t>
+        <w:t>*(Pohon-Pohon Keimanan - أَشْجَارُ الإِيمَانِ)*</w:t>
       </w:r>
     </w:p>
     <w:p>
@@ -1225,7 +1422,7 @@
         <w:spacing w:before="40" w:after="40" w:line="276" w:lineRule="auto"/>
       </w:pPr>
       <w:r>
-        <w:t>Syeikh al-Rasyid membina metafora sastera yang amat memukau: mengibaratkan jiwa mukmin laksana sebuah rimba keimanan yang sarat dengan pohon-pohon yang rendang dan berbuah lebat. Sepuluh pohon keimanan dihuraikan secara artistik dan mendalam sebagai paksi keperibadian daie.</w:t>
+        <w:t>Syeikh al-Rasyid membina metafora sastera yang amat memukau: mengibaratkan jiwa mukmin laksana sebuah rimba keimanan yang sarat dengan pohon-pohon yang rendang dan berbuah lebat. Sepuluh pohon keimanan dihuraikan secara artistik dan mendalam sebagai paksi keperibadian da'i.</w:t>
       </w:r>
     </w:p>
     <w:p>
@@ -1328,6 +1525,11 @@
         <w:spacing w:before="240" w:after="80"/>
       </w:pPr>
       <w:r>
+        <w:rPr>
+          <w:b/>
+          <w:color w:val="2D6A4F"/>
+          <w:sz w:val="26"/>
+        </w:rPr>
         <w:t>📌 BAB 7: "PENJARA" HARAPAN</w:t>
       </w:r>
     </w:p>
@@ -1342,7 +1544,7 @@
           <w:color w:val="081C15"/>
           <w:sz w:val="24"/>
         </w:rPr>
-        <w:t>*(Ḥiṣār al-Amal - حِصَارُ الأَمَلِ)* | Halaman Asal 97 – 112</w:t>
+        <w:t>*(Penjara Harapan - حِصَارُ الأَمَلِ)*</w:t>
       </w:r>
     </w:p>
     <w:p>
@@ -1364,7 +1566,7 @@
         <w:spacing w:before="40" w:after="40" w:line="276" w:lineRule="auto"/>
       </w:pPr>
       <w:r>
-        <w:t>Angan-angan panjang (*tūl al-amal*) adalah racun pembunuh yang melalaikan manusia daripada persiapan akhirat. Syeikh al-Rasyid melukiskan bagaimana angan-angan mengepung daie dengan ilusi masa depan duniawi, lalu mencadangkan penawarnya: menghidupkan ingatan terhadap mati dan merasai betapa hampirnya ajal.</w:t>
+        <w:t>Angan-angan panjang (*tūl al-amal*) adalah racun pembunuh yang melalaikan manusia daripada persiapan akhirat. Syeikh al-Rasyid melukiskan bagaimana angan-angan mengepung da'i dengan ilusi masa depan duniawi, lalu mencadangkan penawarnya: menghidupkan ingatan terhadap mati dan merasai betapa hampirnya ajal.</w:t>
       </w:r>
     </w:p>
     <w:p>
@@ -1493,7 +1695,7 @@
         <w:ind w:left="360"/>
       </w:pPr>
       <w:r>
-        <w:t>Apabila rasa takut kepada kematian pudar, daie mula berundur ke belakang dan mencari kompromi dengan kebatilan.</w:t>
+        <w:t>Apabila rasa takut kepada kematian pudar, da'i mula berundur ke belakang dan mencari kompromi dengan kebatilan.</w:t>
       </w:r>
     </w:p>
     <w:p>
@@ -1544,7 +1746,7 @@
           <w:color w:val="081C15"/>
           <w:sz w:val="24"/>
         </w:rPr>
-        <w:t>*(Tilālunā al-Hāmidah - تِلاَلُنَا الهَامِدَةُ)* | Halaman Asal 113 – 123</w:t>
+        <w:t>*(Tilālunā al-Hāmidah - تِلاَلُنَا الهَامِدَةُ)*</w:t>
       </w:r>
     </w:p>
     <w:p>
@@ -1710,7 +1912,7 @@
         <w:ind w:left="360"/>
       </w:pPr>
       <w:r>
-        <w:t>Kesedaran bahawa waktu untuk beramal adalah sangat singkat; menyeru para daie untuk segera bangkit menyingsing lengan berkhidmat untuk Islam.</w:t>
+        <w:t>Kesedaran bahawa waktu untuk beramal adalah sangat singkat; menyeru para da'i untuk segera bangkit menyingsing lengan berkhidmat untuk Islam.</w:t>
       </w:r>
     </w:p>
     <w:p>
@@ -1738,7 +1940,7 @@
           <w:color w:val="081C15"/>
           <w:sz w:val="24"/>
         </w:rPr>
-        <w:t>*(Madāris al-Mawt - مَدَارِسُ المَوْتِ)* | Halaman Asal 124 – 137</w:t>
+        <w:t>*(Madāris al-Mawt - مَدَارِسُ المَوْتِ)*</w:t>
       </w:r>
     </w:p>
     <w:p>
@@ -1806,8 +2008,13 @@
         <w:ind w:left="360"/>
       </w:pPr>
       <w:r>
+        <w:rPr>
+          <w:b/>
+          <w:color w:val="1B4332"/>
+        </w:rPr>
         <w:t xml:space="preserve">• Muncullah Umar bin Abdul Aziz di Syam: </w:t>
       </w:r>
+      <w:r/>
     </w:p>
     <w:p>
       <w:pPr>
@@ -1847,8 +2054,13 @@
         <w:ind w:left="360"/>
       </w:pPr>
       <w:r>
+        <w:rPr>
+          <w:b/>
+          <w:color w:val="1B4332"/>
+        </w:rPr>
         <w:t xml:space="preserve">• Neraca Hasan al-Basri dalam Fiqh Dakwah: </w:t>
       </w:r>
+      <w:r/>
     </w:p>
     <w:p>
       <w:pPr>
@@ -1888,8 +2100,13 @@
         <w:ind w:left="360"/>
       </w:pPr>
       <w:r>
+        <w:rPr>
+          <w:b/>
+          <w:color w:val="1B4332"/>
+        </w:rPr>
         <w:t xml:space="preserve">• Tarbiah Melalui Pengakuan &amp; Selepas Itu...: </w:t>
       </w:r>
+      <w:r/>
     </w:p>
     <w:p>
       <w:pPr>
@@ -1911,7 +2128,7 @@
           <w:color w:val="2D6A4F"/>
           <w:sz w:val="26"/>
         </w:rPr>
-        <w:t>📌 BAB 10: JANGAN.. WAHAI BELENGGU-BELENGGU BUMI!</w:t>
+        <w:t>📌 BAB 10: TIDAK.. WAHAI BELENGGU-BELENGGU BUMI!</w:t>
       </w:r>
     </w:p>
     <w:p>
@@ -1925,7 +2142,7 @@
           <w:color w:val="081C15"/>
           <w:sz w:val="24"/>
         </w:rPr>
-        <w:t>*(Lā.. Yā Quyūd al-Arḍ - لاَ.. يَا قُيُودَ الأَرْضِ)* | Halaman Asal 138 – 149</w:t>
+        <w:t>*(Lā.. Yā Quyūd al-Arḍ - لاَ.. يَا قُيُودَ الأَرْضِ)*</w:t>
       </w:r>
     </w:p>
     <w:p>
@@ -2016,8 +2233,13 @@
         <w:ind w:left="360"/>
       </w:pPr>
       <w:r>
+        <w:rPr>
+          <w:b/>
+          <w:color w:val="1B4332"/>
+        </w:rPr>
         <w:t xml:space="preserve">• Selepas Itu...: </w:t>
       </w:r>
+      <w:r/>
     </w:p>
     <w:p>
       <w:pPr>
@@ -2025,7 +2247,7 @@
         <w:ind w:left="360"/>
       </w:pPr>
       <w:r>
-        <w:t>Daie yang berjaya melepaskan diri daripada belenggu bumi akan merasai kelapangan jiwa yang luar biasa; langkahnya menjadi ringan dan kata-katanya memiliki wibawa yang menggetarkan musuh.</w:t>
+        <w:t>Da'i yang berjaya melepaskan diri daripada belenggu bumi akan merasai kelapangan jiwa yang luar biasa; langkahnya menjadi ringan dan kata-katanya memiliki wibawa yang menggetarkan musuh.</w:t>
       </w:r>
     </w:p>
     <w:p>
@@ -2053,7 +2275,7 @@
           <w:color w:val="081C15"/>
           <w:sz w:val="24"/>
         </w:rPr>
-        <w:t>*(Al-'Abd al-Hurr - العَبْدُ الحُرُّ)* | Halaman Asal 150 – 162</w:t>
+        <w:t>*(Al-'Abd al-Hurr - العَبْدُ الحُرُّ)*</w:t>
       </w:r>
     </w:p>
     <w:p>
@@ -2181,7 +2403,7 @@
           <w:color w:val="2D6A4F"/>
           <w:sz w:val="26"/>
         </w:rPr>
-        <w:t>📌 BAB 12: KISAH-KISAH "HIBURAN" PARA DAIE</w:t>
+        <w:t>📌 BAB 12: KISAH-KISAH "HIBURAN" PARA DA'I</w:t>
       </w:r>
     </w:p>
     <w:p>
@@ -2195,7 +2417,7 @@
           <w:color w:val="081C15"/>
           <w:sz w:val="24"/>
         </w:rPr>
-        <w:t>*(Qiṣaṣ min Lahw al-Du'āt - قِصَصٌ مِنْ لَهْوِ الدُّعَاةِ)* | Halaman Asal 163 – 175</w:t>
+        <w:t>*(Qiṣaṣ min Lahw al-Du'āt - قِصَصٌ مِنْ لَهْوِ الدُّعَاةِ)*</w:t>
       </w:r>
     </w:p>
     <w:p>
@@ -2217,7 +2439,7 @@
         <w:spacing w:before="40" w:after="40" w:line="276" w:lineRule="auto"/>
       </w:pPr>
       <w:r>
-        <w:t>Bab kemuncak yang penuh dengan sentuhan estetika dan paradoks sastera dakwah: Syeikh al-Rasyid menggunakan istilah *"lahw"* (hiburan/keseronokan) secara ironi. "Hiburan" bagi seorang daie bukanlah bersenang-lenang atau membuang masa, tetapi "hiburan" mereka adalah berpenat-lelah menuntut ilmu, berhijrah, berjihad, meringkuk di penjara, dan syahid di jalan Allah!</w:t>
+        <w:t>Bab kemuncak yang penuh dengan sentuhan estetika dan paradoks sastera dakwah: Syeikh al-Rasyid menggunakan istilah *"lahw"* (hiburan/keseronokan) secara ironi. "Hiburan" bagi seorang da'i bukanlah bersenang-lenang atau membuang masa, tetapi "hiburan" mereka adalah berpenat-lelah menuntut ilmu, berhijrah, berjihad, meringkuk di penjara, dan syahid di jalan Allah!</w:t>
       </w:r>
     </w:p>
     <w:p>
@@ -2254,7 +2476,7 @@
         <w:ind w:left="360"/>
       </w:pPr>
       <w:r>
-        <w:t>Daie hidup dengan kebebasan yang mematahkan belenggu syahwat dan harapan yang membakar keyakinan kemenangan.</w:t>
+        <w:t>Da'i hidup dengan kebebasan yang mematahkan belenggu syahwat dan harapan yang membakar keyakinan kemenangan.</w:t>
       </w:r>
     </w:p>
     <w:p>
@@ -2267,7 +2489,7 @@
           <w:b/>
           <w:color w:val="1B4332"/>
         </w:rPr>
-        <w:t xml:space="preserve">• Berbicara Siang dan Malam: </w:t>
+        <w:t xml:space="preserve">• Berdakwah Siang dan Malam: </w:t>
       </w:r>
       <w:r/>
     </w:p>
@@ -2290,7 +2512,7 @@
           <w:b/>
           <w:color w:val="1B4332"/>
         </w:rPr>
-        <w:t xml:space="preserve">• Berbicara Ketika Langkah-Langkah Hijrah: </w:t>
+        <w:t xml:space="preserve">• Berdakwah Ketika Langkah-Langkah Hijrah: </w:t>
       </w:r>
       <w:r/>
     </w:p>
@@ -2313,7 +2535,7 @@
           <w:b/>
           <w:color w:val="1B4332"/>
         </w:rPr>
-        <w:t xml:space="preserve">• Berbicara di dalam Penjara: </w:t>
+        <w:t xml:space="preserve">• Berdakwah di dalam Penjara: </w:t>
       </w:r>
       <w:r/>
     </w:p>
@@ -2405,7 +2627,7 @@
           <w:b/>
           <w:color w:val="1B4332"/>
         </w:rPr>
-        <w:t xml:space="preserve">• Kubu Tarbiah al-Asadiyyah: </w:t>
+        <w:t xml:space="preserve">• Kubu Tarbiah al-Asadiah: </w:t>
       </w:r>
       <w:r/>
     </w:p>
@@ -2451,7 +2673,7 @@
           <w:b/>
           <w:color w:val="1B4332"/>
         </w:rPr>
-        <w:t xml:space="preserve">• Menggalas Uncang Ilmu dengan Berjalan Kaki: </w:t>
+        <w:t xml:space="preserve">• Al-Kausaj Menjelajah Mencari Ilmu dengan Berjalan Kaki: </w:t>
       </w:r>
       <w:r/>
     </w:p>
@@ -2470,8 +2692,13 @@
         <w:ind w:left="360"/>
       </w:pPr>
       <w:r>
+        <w:rPr>
+          <w:b/>
+          <w:color w:val="1B4332"/>
+        </w:rPr>
         <w:t xml:space="preserve">• Ulama Mazhab Hanbali Memelihara Keterampilan dan Wibawa: </w:t>
       </w:r>
+      <w:r/>
     </w:p>
     <w:p>
       <w:pPr>
@@ -2511,8 +2738,13 @@
         <w:ind w:left="360"/>
       </w:pPr>
       <w:r>
+        <w:rPr>
+          <w:b/>
+          <w:color w:val="1B4332"/>
+        </w:rPr>
         <w:t xml:space="preserve">• Kemuliaan Tatkala Saat Kematian... !: </w:t>
       </w:r>
+      <w:r/>
     </w:p>
     <w:p>
       <w:pPr>
@@ -2548,7 +2780,7 @@
           <w:color w:val="081C15"/>
           <w:sz w:val="24"/>
         </w:rPr>
-        <w:t>*(Wa Intazhir «al-Bawāriq» - وَانْتَظِرْ «البَوَارِقَ»)* | Halaman Asal 175</w:t>
+        <w:t>*(Wa Intazhir «al-Bawāriq» - وَانْتَظِرْ «البَوَارِقَ»)*</w:t>
       </w:r>
     </w:p>
     <w:p>

</xml_diff>

<commit_message>
Murnikan ejaan Harakiah dan Falsafah Bahimiah (Kehaiwanan) (v36)
</commit_message>
<xml_diff>
--- a/INTISARI_ILMIAH_LENGKAP_AL_RAQAIQ.docx
+++ b/INTISARI_ILMIAH_LENGKAP_AL_RAQAIQ.docx
@@ -230,7 +230,7 @@
           <w:b/>
           <w:color w:val="1B4332"/>
         </w:rPr>
-        <w:t xml:space="preserve">• Firasat Meneliti Diri dan Neraca Tarbiah Harakiyyah: </w:t>
+        <w:t xml:space="preserve">• Firasat Meneliti Diri dan Neraca Tarbiah Harakiah: </w:t>
       </w:r>
       <w:r/>
     </w:p>
@@ -439,7 +439,7 @@
           <w:b/>
           <w:color w:val="1B4332"/>
         </w:rPr>
-        <w:t xml:space="preserve">• Ketinggian Iman Mendepani Falsafah Bahimiyyah: </w:t>
+        <w:t xml:space="preserve">• Ketinggian Iman Mendepani Falsafah Bahimiah (Kehaiwanan): </w:t>
       </w:r>
       <w:r/>
     </w:p>

</xml_diff>

<commit_message>
feat: selaraskan 5 subtajuk Bab 11 berasaskan mufasalah, naik taraf PWA v37
</commit_message>
<xml_diff>
--- a/INTISARI_ILMIAH_LENGKAP_AL_RAQAIQ.docx
+++ b/INTISARI_ILMIAH_LENGKAP_AL_RAQAIQ.docx
@@ -2297,7 +2297,7 @@
         <w:spacing w:before="40" w:after="40" w:line="276" w:lineRule="auto"/>
       </w:pPr>
       <w:r>
-        <w:t>Paradoks agung dalam Islam: seseorang insan hanya akan mencapai kemerdekaan hakiki apabila dia menzahirkan penghambaan mutlak (*'ubudiyyah*) kepada Allah Taala semata-mata. Hamba yang merdeka adalah insan yang jiwanya bebas daripada tunduk kepada hawa nafsu dan kezaliman penguasa thaghut.</w:t>
+        <w:t>Paradoks agung dalam Islam: seseorang insan hanya akan mencapai kemerdekaan hakiki apabila dia menzahirkan penghambaan mutlak (*'ubudiyyah*) kepada Allah Taala semata-mata. Hamba yang merdeka adalah insan yang jiwanya bebas daripada belenggu jahiliah dan hawa nafsu menerusi pemisahan prinsip (*al-mufāṣalah*), serta memiliki kemuliaan iman (*'izzah*) di hadapan penguasa dunia.</w:t>
       </w:r>
     </w:p>
     <w:p>
@@ -2324,7 +2324,7 @@
           <w:b/>
           <w:color w:val="1B4332"/>
         </w:rPr>
-        <w:t xml:space="preserve">• Pembebasan Jiwa daripada Kehambaan Hawa Nafsu: </w:t>
+        <w:t xml:space="preserve">• Pemisahan Prinsip dan Rukun Tasawur Islam: </w:t>
       </w:r>
       <w:r/>
     </w:p>
@@ -2334,7 +2334,180 @@
         <w:ind w:left="360"/>
       </w:pPr>
       <w:r>
-        <w:t>Menghambakan diri kepada nafsu adalah seburuk-buruk perhambaan; orang yang mengejar kemasyhuran sebenarnya diperhamba oleh pandangan manusia.</w:t>
+        <w:t>Jiwa yang bangkit dengan keazaman tinggi (*al-himam al-'āliyah*) menyempurnakan kebangkitannya dengan pemisahan prinsip (*tamayyuz*).</w:t>
+      </w:r>
+    </w:p>
+    <w:p>
+      <w:pPr>
+        <w:spacing w:before="40" w:after="40"/>
+        <w:ind w:left="360"/>
+      </w:pPr>
+      <w:r>
+        <w:t>Empat rukun tasawur Sayyid Qutb: Kewarganegaraan = akidah, Tanah air = Dar al-Islam, Pemerintah = Allah, Perlembagaan = al-Quran; bersih daripada syirik bangsa, kaum, dan tanah air.</w:t>
+      </w:r>
+    </w:p>
+    <w:p>
+      <w:pPr>
+        <w:spacing w:before="40" w:after="40"/>
+        <w:ind w:left="360"/>
+      </w:pPr>
+      <w:r>
+        <w:t>Surah Ghafir: 14 menegaskan tiada titik pertemuan antara iman dan kufur, menuntut da'i berpegang teguh tanpa mengharapkan keredaan orang kafir.</w:t>
+      </w:r>
+    </w:p>
+    <w:p>
+      <w:pPr>
+        <w:spacing w:before="40" w:after="40"/>
+        <w:ind w:left="360"/>
+      </w:pPr>
+      <w:r>
+        <w:rPr>
+          <w:b/>
+          <w:color w:val="1B4332"/>
+        </w:rPr>
+        <w:t xml:space="preserve">• Pemisahan Nabawi dan Tarbiah Keluhuran Iman: </w:t>
+      </w:r>
+      <w:r/>
+    </w:p>
+    <w:p>
+      <w:pPr>
+        <w:spacing w:before="40" w:after="40"/>
+        <w:ind w:left="360"/>
+      </w:pPr>
+      <w:r>
+        <w:t>Pemisahan era Mekah dan Madinah adalah hakikat keimanan dan nikmat ketuhanan.</w:t>
+      </w:r>
+    </w:p>
+    <w:p>
+      <w:pPr>
+        <w:spacing w:before="40" w:after="40"/>
+        <w:ind w:left="360"/>
+      </w:pPr>
+      <w:r>
+        <w:t>Menghayati hadis Sahih Muslim ketika solat Isyak lewat malam: *"Bergembiralah kamu! Sesungguhnya antara nikmat Allah ke atas kamu ialah tiada seorang pun dalam kalangan manusia yang menunaikan solat pada saat ini melainkan kamu!"*</w:t>
+      </w:r>
+    </w:p>
+    <w:p>
+      <w:pPr>
+        <w:spacing w:before="40" w:after="40"/>
+        <w:ind w:left="360"/>
+      </w:pPr>
+      <w:r>
+        <w:t>Mentarbiah jiwa da'i dengan makna keluhuran (*al-isti'lā'*) mencabar kebatilan di sekelilingnya walau dalam jumlah minoriti.</w:t>
+      </w:r>
+    </w:p>
+    <w:p>
+      <w:pPr>
+        <w:spacing w:before="40" w:after="40"/>
+        <w:ind w:left="360"/>
+      </w:pPr>
+      <w:r>
+        <w:rPr>
+          <w:b/>
+          <w:color w:val="1B4332"/>
+        </w:rPr>
+        <w:t xml:space="preserve">• Barisan Pelopor dan Hakikat Pembebasan Syahadah: </w:t>
+      </w:r>
+      <w:r/>
+    </w:p>
+    <w:p>
+      <w:pPr>
+        <w:spacing w:before="40" w:after="40"/>
+        <w:ind w:left="360"/>
+      </w:pPr>
+      <w:r>
+        <w:t>Barisan pelopor (*ṭalī'ah islāmiah*) yang mengamalkan pemisahan prinsip di satu pihak dan pergaulan dakwah di pihak yang lain.</w:t>
+      </w:r>
+    </w:p>
+    <w:p>
+      <w:pPr>
+        <w:spacing w:before="40" w:after="40"/>
+        <w:ind w:left="360"/>
+      </w:pPr>
+      <w:r>
+        <w:t>Hakikat syahadah adalah tindakan melepaskan diri (*al-inkhilā'*) daripada nilai, kepimpinan, dan perlembagaan jahiliah menuju kesetiaan mutlak kepada jemaah Islam.</w:t>
+      </w:r>
+    </w:p>
+    <w:p>
+      <w:pPr>
+        <w:spacing w:before="40" w:after="40"/>
+        <w:ind w:left="360"/>
+      </w:pPr>
+      <w:r>
+        <w:t>Madinah menjadi mercu tanda bercahaya dan pelindung bagi jiwa yang mencari kebenaran.</w:t>
+      </w:r>
+    </w:p>
+    <w:p>
+      <w:pPr>
+        <w:spacing w:before="40" w:after="40"/>
+        <w:ind w:left="360"/>
+      </w:pPr>
+      <w:r>
+        <w:rPr>
+          <w:b/>
+          <w:color w:val="1B4332"/>
+        </w:rPr>
+        <w:t xml:space="preserve">• Pemisahan Kedua: Mematikan Kebatilan dengan Memulaukannya: </w:t>
+      </w:r>
+      <w:r/>
+    </w:p>
+    <w:p>
+      <w:pPr>
+        <w:spacing w:before="40" w:after="40"/>
+        <w:ind w:left="360"/>
+      </w:pPr>
+      <w:r>
+        <w:t>Keperluan pemisahan kedua terhadap sisa kemunafikan dan dorongan hawa nafsu selepas tertegaknya kemenangan Islam.</w:t>
+      </w:r>
+    </w:p>
+    <w:p>
+      <w:pPr>
+        <w:spacing w:before="40" w:after="40"/>
+        <w:ind w:left="360"/>
+      </w:pPr>
+      <w:r>
+        <w:t>Wasiat Umar bin al-Khattab RA: *"Sesungguhnya Allah memiliki hamba-hamba yang mematikan kebatilan dengan meninggalkannya (hajrihi), dan menghidupkan kebenaran dengan menyebutnya!"*</w:t>
+      </w:r>
+    </w:p>
+    <w:p>
+      <w:pPr>
+        <w:spacing w:before="40" w:after="40"/>
+        <w:ind w:left="360"/>
+      </w:pPr>
+      <w:r>
+        <w:t>Membentengi masyarakat agar peredaran zaman tidak mengubah kebatilan menjadi kebenaran palsu.</w:t>
+      </w:r>
+    </w:p>
+    <w:p>
+      <w:pPr>
+        <w:spacing w:before="40" w:after="40"/>
+        <w:ind w:left="360"/>
+      </w:pPr>
+      <w:r>
+        <w:rPr>
+          <w:b/>
+          <w:color w:val="1B4332"/>
+        </w:rPr>
+        <w:t xml:space="preserve">• Da'i sebagai Model Teladan yang Merdeka: </w:t>
+      </w:r>
+      <w:r/>
+    </w:p>
+    <w:p>
+      <w:pPr>
+        <w:spacing w:before="40" w:after="40"/>
+        <w:ind w:left="360"/>
+      </w:pPr>
+      <w:r>
+        <w:t>Di tengah ketiadaan model pemerintahan Islam hari ini, keagungan Islam terjelma pada peribadi-peribadi pendakwah yang memiliki keikhlasan total (*tajarrud*) dan mengikut Sunnah.</w:t>
+      </w:r>
+    </w:p>
+    <w:p>
+      <w:pPr>
+        <w:spacing w:before="40" w:after="40"/>
+        <w:ind w:left="360"/>
+      </w:pPr>
+      <w:r>
+        <w:t>Hakikat teladan Islam (*al-qudwah al-islāmiah*): peribadi yang merdeka dalam fikiran, akidah, dan amal; memancarkan ketenangan dan wibawa sebagai bukti keunggulan tarbiah Islam.</w:t>
       </w:r>
     </w:p>
     <w:p>

</xml_diff>

<commit_message>
feat: selaraskan 3 subtajuk Bab 10 Pilihan 1, naik taraf PWA v38
</commit_message>
<xml_diff>
--- a/INTISARI_ILMIAH_LENGKAP_AL_RAQAIQ.docx
+++ b/INTISARI_ILMIAH_LENGKAP_AL_RAQAIQ.docx
@@ -2191,7 +2191,7 @@
           <w:b/>
           <w:color w:val="1B4332"/>
         </w:rPr>
-        <w:t xml:space="preserve">• Hakikat Belenggu Dunia dan Rayuannya: </w:t>
+        <w:t xml:space="preserve">• Menolak Keluhan Pasif dan Menyahut Seruan Himmah: </w:t>
       </w:r>
       <w:r/>
     </w:p>
@@ -2201,7 +2201,53 @@
         <w:ind w:left="360"/>
       </w:pPr>
       <w:r>
-        <w:t>Dunia datang memikat dengan pelbagai hiasan yang mempesonakan; aktivis yang lemah azamnya akan perlahan-lahan terjerat dan mula meninggalkan medan perjuangan.</w:t>
+        <w:t>Membongkar hakikat bahawa kesedihan dan rintihan pasif melihat kemunduran umat langsung tidak memberi manfaat jika tidak diiringi dengan tindakan pembetulan (*istidrāk*). Menyahut seruan Syeikh Abdul Qadir al-Kailani agar bangkit melangkah bersama para pemilik himmah yang tinggi.</w:t>
+      </w:r>
+    </w:p>
+    <w:p>
+      <w:pPr>
+        <w:spacing w:before="40" w:after="40"/>
+        <w:ind w:left="360"/>
+      </w:pPr>
+      <w:r>
+        <w:rPr>
+          <w:b/>
+          <w:color w:val="1B4332"/>
+        </w:rPr>
+        <w:t xml:space="preserve">• Memecahkan Belenggu Syahwat dan Tarikan Kerehatan: </w:t>
+      </w:r>
+      <w:r/>
+    </w:p>
+    <w:p>
+      <w:pPr>
+        <w:spacing w:before="40" w:after="40"/>
+        <w:ind w:left="360"/>
+      </w:pPr>
+      <w:r>
+        <w:t>Mendedahkan muslihat nafsu yang memanjakan diri dengan kerehatan, tuntutan anak isteri, dan kemewahan yang mengikat jiwa. Da'i sejati membebaskan hatinya daripada belenggu syahwat dan bersedia menempuh jalan pengorbanan tanpa rasa takut.</w:t>
+      </w:r>
+    </w:p>
+    <w:p>
+      <w:pPr>
+        <w:spacing w:before="40" w:after="40"/>
+        <w:ind w:left="360"/>
+      </w:pPr>
+      <w:r>
+        <w:rPr>
+          <w:b/>
+          <w:color w:val="1B4332"/>
+        </w:rPr>
+        <w:t xml:space="preserve">• Kemuliaan Darjat Melalui Ilmu, Jihad, dan Cita-Cita Helang: </w:t>
+      </w:r>
+      <w:r/>
+    </w:p>
+    <w:p>
+      <w:pPr>
+        <w:spacing w:before="40" w:after="40"/>
+        <w:ind w:left="360"/>
+      </w:pPr>
+      <w:r>
+        <w:t>Mengupas empat ayat al-Quran tentang pengangkatan darjat (*al-darajāt al-'ulā*) yang berpaksi kepada ilmu dan jihad. Membina cita-cita tinggi ibarat burung helang yang menolak untuk turun ke tanah tandus, serta menghayati wasiat ketenteraan Imam Hasan al-Banna.</w:t>
       </w:r>
     </w:p>
     <w:p>

</xml_diff>

<commit_message>
feat(bab4): pembahagian Subtajuk 8 kepada 5 subtajuk mandiri (total 97 subtajuk) - PWA v40
</commit_message>
<xml_diff>
--- a/INTISARI_ILMIAH_LENGKAP_AL_RAQAIQ.docx
+++ b/INTISARI_ILMIAH_LENGKAP_AL_RAQAIQ.docx
@@ -1121,7 +1121,7 @@
           <w:b/>
           <w:color w:val="1B4332"/>
         </w:rPr>
-        <w:t xml:space="preserve">• Ujian Kelapangan Masa dan Kelalaian: </w:t>
+        <w:t xml:space="preserve">• Hakikat Ujian Kelalaian dan Jiwa yang Diwakafkan untuk Allah: </w:t>
       </w:r>
       <w:r/>
     </w:p>
@@ -1131,7 +1131,99 @@
         <w:ind w:left="360"/>
       </w:pPr>
       <w:r>
-        <w:t>Masa lapang adalah jerangkap maut bagi aktivis; ruang kosong yang tidak diisi dengan kebaikan pasti akan diracuni oleh fitnah syubhat dan syahwat.</w:t>
+        <w:t>Ujian terbesar pendakwah bukanlah mehnah penjara semata-mata, sebaliknya kelalaian; jiwa da'i adalah harta wakaf milik Allah Taala (*Waqfun Lillahi Ta'ala*) yang wajib sentiasa dinyalakan dengan api keprihatinan dakwah.</w:t>
+      </w:r>
+    </w:p>
+    <w:p>
+      <w:pPr>
+        <w:spacing w:before="40" w:after="40"/>
+        <w:ind w:left="360"/>
+      </w:pPr>
+      <w:r>
+        <w:rPr>
+          <w:b/>
+          <w:color w:val="1B4332"/>
+        </w:rPr>
+        <w:t xml:space="preserve">• Bahaya Kerehatan dan Kewaspadaan daripada Lena Kelalaian: </w:t>
+      </w:r>
+      <w:r/>
+    </w:p>
+    <w:p>
+      <w:pPr>
+        <w:spacing w:before="40" w:after="40"/>
+        <w:ind w:left="360"/>
+      </w:pPr>
+      <w:r>
+        <w:t>Kerehatan bagi pejuang merupakan satu kelalaian; kerehatan fizikal dan perkara mubah hanya diambil sekadar memulihkan kesegaran jasad untuk kembali beramal dan berwaspada di benteng dakwah.</w:t>
+      </w:r>
+    </w:p>
+    <w:p>
+      <w:pPr>
+        <w:spacing w:before="40" w:after="40"/>
+        <w:ind w:left="360"/>
+      </w:pPr>
+      <w:r>
+        <w:rPr>
+          <w:b/>
+          <w:color w:val="1B4332"/>
+        </w:rPr>
+        <w:t xml:space="preserve">• Fitnah Ketamadunan Moden dan Neraca Masa Imam Hasan al-Banna: </w:t>
+      </w:r>
+      <w:r/>
+    </w:p>
+    <w:p>
+      <w:pPr>
+        <w:spacing w:before="40" w:after="40"/>
+        <w:ind w:left="360"/>
+      </w:pPr>
+      <w:r>
+        <w:t>Ketamadunan moden memudahkan limpahan fitnah syahwat dan kelalaian; da'i wajib menghayati neraca Imam Hasan al-Banna bahawa *"Masa itu ialah Kehidupan"* dan merancang setiap detik untuk ketaatan.</w:t>
+      </w:r>
+    </w:p>
+    <w:p>
+      <w:pPr>
+        <w:spacing w:before="40" w:after="40"/>
+        <w:ind w:left="360"/>
+      </w:pPr>
+      <w:r>
+        <w:rPr>
+          <w:b/>
+          <w:color w:val="1B4332"/>
+        </w:rPr>
+        <w:t xml:space="preserve">• Keteladanan Imam Ahmad Menanggalkan Kerehatan dalam Mehnah: </w:t>
+      </w:r>
+      <w:r/>
+    </w:p>
+    <w:p>
+      <w:pPr>
+        <w:spacing w:before="40" w:after="40"/>
+        <w:ind w:left="360"/>
+      </w:pPr>
+      <w:r>
+        <w:t>Maruah pejuang menuntut penanggalan kerehatan; mencontohi ketabahan Imam Ahmad yang mencurahkan segenap tenaga keupayaan (*badzaltu majhūdī*) sehingga keletihan fizikal bertukar menjadi kelazatan rohani.</w:t>
+      </w:r>
+    </w:p>
+    <w:p>
+      <w:pPr>
+        <w:spacing w:before="40" w:after="40"/>
+        <w:ind w:left="360"/>
+      </w:pPr>
+      <w:r>
+        <w:rPr>
+          <w:b/>
+          <w:color w:val="1B4332"/>
+        </w:rPr>
+        <w:t xml:space="preserve">• Kerehatan Hakiki pada Langkah Pertama Menjejak Syurga: </w:t>
+      </w:r>
+      <w:r/>
+    </w:p>
+    <w:p>
+      <w:pPr>
+        <w:spacing w:before="40" w:after="40"/>
+        <w:ind w:left="360"/>
+      </w:pPr>
+      <w:r>
+        <w:t>Kerehatan sejati bagi da'i bukanlah di atas tilam dunia, melainkan tatkala kaki pertama melangkah masuk ke dalam Syurga; fajar ganjaran pahala meringankan segala beban taklif.</w:t>
       </w:r>
     </w:p>
     <w:p>

</xml_diff>

<commit_message>
feat(bab3): tambah subtajuk 'Kecelaruan Niat dan Jerangkap Angan-Angan Kosong' (total 98 subtajuk) - PWA v41
</commit_message>
<xml_diff>
--- a/INTISARI_ILMIAH_LENGKAP_AL_RAQAIQ.docx
+++ b/INTISARI_ILMIAH_LENGKAP_AL_RAQAIQ.docx
@@ -865,7 +865,7 @@
         <w:ind w:left="360"/>
       </w:pPr>
       <w:r>
-        <w:t>Niat yang tulus ikhlas adalah "ruh" bagi setiap gerak kerja; tanpa keikhlasan, amal sebesar gunung akan hancur menjadi debu berterbangan.</w:t>
+        <w:t>Niat yang tulus ikhlas (*al-niyyah al-hurrah*) adalah "ruh" bagi setiap gerak kerja; tanpa keikhlasan, amal sebesar gunung akan hancur menjadi debu berterbangan.</w:t>
       </w:r>
     </w:p>
     <w:p>
@@ -874,7 +874,39 @@
         <w:ind w:left="360"/>
       </w:pPr>
       <w:r>
-        <w:t>Sentiasa memperbaharui dan memeriksa niat pada setiap persimpangan jalan agar tidak diragut oleh penyakit riak dan ujub.</w:t>
+        <w:t>Mencontohi Umar bin Abdul Aziz yang tidak melangkah melainkan dengan niat kerana Allah, sehingga amalan kecil menjadi agung.</w:t>
+      </w:r>
+    </w:p>
+    <w:p>
+      <w:pPr>
+        <w:spacing w:before="40" w:after="40"/>
+        <w:ind w:left="360"/>
+      </w:pPr>
+      <w:r>
+        <w:rPr>
+          <w:b/>
+          <w:color w:val="1B4332"/>
+        </w:rPr>
+        <w:t xml:space="preserve">• Kecelaruan Niat dan Jerangkap Angan-Angan Kosong: </w:t>
+      </w:r>
+      <w:r/>
+    </w:p>
+    <w:p>
+      <w:pPr>
+        <w:spacing w:before="40" w:after="40"/>
+        <w:ind w:left="360"/>
+      </w:pPr>
+      <w:r>
+        <w:t>Percampuran niat mencetuskan kegelisahan batin dan kecelaruan hidup; jiwa yang tidak terurus tidak mampu memimpin perubahan di sekelilingnya.</w:t>
+      </w:r>
+    </w:p>
+    <w:p>
+      <w:pPr>
+        <w:spacing w:before="40" w:after="40"/>
+        <w:ind w:left="360"/>
+      </w:pPr>
+      <w:r>
+        <w:t>Membezakan secara tegas antara niat yang benar dengan angan-angan kosong (*al-umniyyah*) yang melahirkan sikap bertangguh dan melemahkan disiplin amal.</w:t>
       </w:r>
     </w:p>
     <w:p>

</xml_diff>

<commit_message>
feat(bab2): tambah subtajuk 'Menggapai Hasil Citra Madrasah Malam' (total 99 subtajuk) - PWA v42
</commit_message>
<xml_diff>
--- a/INTISARI_ILMIAH_LENGKAP_AL_RAQAIQ.docx
+++ b/INTISARI_ILMIAH_LENGKAP_AL_RAQAIQ.docx
@@ -714,7 +714,39 @@
         <w:ind w:left="360"/>
       </w:pPr>
       <w:r>
-        <w:t>Solat malam melahirkan ketenangan jiwa yang teguh, wajah yang bercahaya, dan ketajaman bashirah.</w:t>
+        <w:t>Kemenangan dakwah bukan diukur pada banyaknya risalah dicetak, tetapi anugerah Allah yang diletakkan di tangan aktivis yang melazimi madrasah malam.</w:t>
+      </w:r>
+    </w:p>
+    <w:p>
+      <w:pPr>
+        <w:spacing w:before="40" w:after="40"/>
+        <w:ind w:left="360"/>
+      </w:pPr>
+      <w:r>
+        <w:rPr>
+          <w:b/>
+          <w:color w:val="1B4332"/>
+        </w:rPr>
+        <w:t xml:space="preserve">• Menggapai Hasil Citra Madrasah Malam: </w:t>
+      </w:r>
+      <w:r/>
+    </w:p>
+    <w:p>
+      <w:pPr>
+        <w:spacing w:before="40" w:after="40"/>
+        <w:ind w:left="360"/>
+      </w:pPr>
+      <w:r>
+        <w:t>Madrasah malam mengurniakan mutiara keikhlasan dan menelanjangi tipu daya angan-angan duniawi yang memperdayakan da'i ibarat sesumpah yang bertukar warna.</w:t>
+      </w:r>
+    </w:p>
+    <w:p>
+      <w:pPr>
+        <w:spacing w:before="40" w:after="40"/>
+        <w:ind w:left="360"/>
+      </w:pPr>
+      <w:r>
+        <w:t>Menghayati bait syair *Yā laylu qiyāmuka madrasah*; qiamullail melahirkan jiwa yang hidup yang mampu memancarkan kesan tarbiah kepada hati insan lain.</w:t>
       </w:r>
     </w:p>
     <w:p>

</xml_diff>

<commit_message>
feat(bab1): rombakan Bab 1 kepada 6 subtajuk (total 101 subtajuk) - PWA v43
</commit_message>
<xml_diff>
--- a/INTISARI_ILMIAH_LENGKAP_AL_RAQAIQ.docx
+++ b/INTISARI_ILMIAH_LENGKAP_AL_RAQAIQ.docx
@@ -472,7 +472,7 @@
           <w:color w:val="2D6A4F"/>
           <w:sz w:val="26"/>
         </w:rPr>
-        <w:t>📌 BAB 1: TASBIH MENGUKUHKAN KEKUASAAN</w:t>
+        <w:t>📌 BAB 1: TASBIH MENGUKUHKAN KERAJAAN</w:t>
       </w:r>
     </w:p>
     <w:p>
@@ -524,6 +524,102 @@
         <w:t xml:space="preserve">Intisari Subtajuk: </w:t>
       </w:r>
       <w:r/>
+    </w:p>
+    <w:p>
+      <w:pPr>
+        <w:spacing w:before="40" w:after="40"/>
+        <w:ind w:left="360"/>
+      </w:pPr>
+      <w:r>
+        <w:rPr>
+          <w:b/>
+          <w:color w:val="1B4332"/>
+        </w:rPr>
+        <w:t xml:space="preserve">• Bermula Langkah daripada Masjid: </w:t>
+      </w:r>
+      <w:r/>
+    </w:p>
+    <w:p>
+      <w:pPr>
+        <w:spacing w:before="40" w:after="40"/>
+        <w:ind w:left="360"/>
+      </w:pPr>
+      <w:r>
+        <w:t>Masjid adalah titik tolak pembinaan masyarakat Islam dan pangkalan penyatuan fikrah harakiah; meneladani langkah Rasulullah SAW memulakan pembinaan Madinah dari masjid.</w:t>
+      </w:r>
+    </w:p>
+    <w:p>
+      <w:pPr>
+        <w:spacing w:before="40" w:after="40"/>
+        <w:ind w:left="360"/>
+      </w:pPr>
+      <w:r>
+        <w:t>Melazimi masjid menghimpunkan 8 kurniaan agung termasuk ilmu yang mantap, persaudaraan yang tulus, dan rahmat Allah.</w:t>
+      </w:r>
+    </w:p>
+    <w:p>
+      <w:pPr>
+        <w:spacing w:before="40" w:after="40"/>
+        <w:ind w:left="360"/>
+      </w:pPr>
+      <w:r>
+        <w:rPr>
+          <w:b/>
+          <w:color w:val="1B4332"/>
+        </w:rPr>
+        <w:t xml:space="preserve">• Solat, Zikir dan Tasbih: </w:t>
+      </w:r>
+      <w:r/>
+    </w:p>
+    <w:p>
+      <w:pPr>
+        <w:spacing w:before="40" w:after="40"/>
+        <w:ind w:left="360"/>
+      </w:pPr>
+      <w:r>
+        <w:t>Amalan solat, zikir, dan tasbih merupakan bekal rohani paling utama bagi da'i dalam mengangkat kelemahan dan kefakiran dirinya di hadapan Allah.</w:t>
+      </w:r>
+    </w:p>
+    <w:p>
+      <w:pPr>
+        <w:spacing w:before="40" w:after="40"/>
+        <w:ind w:left="360"/>
+      </w:pPr>
+      <w:r>
+        <w:t>Menghayati bait Abdullah bin al-Mubarak: merebut dua rakaat dan menukar kata-kata batil kepada tasbih, serta wasiat Hasan al-Banna tentang saat hening bermunajat harian.</w:t>
+      </w:r>
+    </w:p>
+    <w:p>
+      <w:pPr>
+        <w:spacing w:before="40" w:after="40"/>
+        <w:ind w:left="360"/>
+      </w:pPr>
+      <w:r>
+        <w:rPr>
+          <w:b/>
+          <w:color w:val="1B4332"/>
+        </w:rPr>
+        <w:t xml:space="preserve">• Tahap-Tahap Merealisasikan Matlamat Ubudiah: </w:t>
+      </w:r>
+      <w:r/>
+    </w:p>
+    <w:p>
+      <w:pPr>
+        <w:spacing w:before="40" w:after="40"/>
+        <w:ind w:left="360"/>
+      </w:pPr>
+      <w:r>
+        <w:t>Taujihad agung Imam al-Maududi berkenaan manhaj bertahap-tahap (*al-tadarruj*) para rasul menegakkan ubudiah di muka bumi.</w:t>
+      </w:r>
+    </w:p>
+    <w:p>
+      <w:pPr>
+        <w:spacing w:before="40" w:after="40"/>
+        <w:ind w:left="360"/>
+      </w:pPr>
+      <w:r>
+        <w:t>Melatih dan membersihkan jiwa kader dakwah terlebih dahulu sebelum memakaikan mereka pakaian amanah kepimpinan dan hukum.</w:t>
+      </w:r>
     </w:p>
     <w:p>
       <w:pPr>

</xml_diff>